<commit_message>
Add CPU baseline test results
</commit_message>
<xml_diff>
--- a/docs/Group8_PPT_Generation_Brief.docx
+++ b/docs/Group8_PPT_Generation_Brief.docx
@@ -81,7 +81,7 @@
     </w:p>
     <w:p>
       <w:r>
-        <w:t>This project evaluates whether large language models and code-specific encoders can detect defective C/C++ functions from the CodeXGLUE defect detection benchmark. We compare four increasingly task-adapted approaches: zero-shot Qwen, 4-shot Qwen, LoRA fine-tuned Qwen, and a supervised GraphCodeBERT encoder baseline. The main finding is that prompt-only LLM use is not reliable for this task, LoRA fine-tuning improves stability but remains limited, and GraphCodeBERT achieves the strongest validation and test performance.</w:t>
+        <w:t>This project evaluates whether large language models and code-specific encoders can detect defective C/C++ functions from the CodeXGLUE defect detection benchmark. We compare prompt-only Qwen, LoRA fine-tuned Qwen, traditional TF-IDF CPU baselines, and a supervised GraphCodeBERT encoder baseline. The main finding is that prompt-only LLM use is not reliable for this task, TF-IDF baselines are surprisingly competitive, and GraphCodeBERT achieves the strongest balanced test Macro-F1.</w:t>
       </w:r>
     </w:p>
     <w:p>
@@ -159,7 +159,7 @@
         <w:pStyle w:val="ListNumber"/>
       </w:pPr>
       <w:r>
-        <w:t>Introduce the experimental ladder: zero-shot -&gt; 4-shot -&gt; LoRA fine-tuning -&gt; GraphCodeBERT.</w:t>
+        <w:t>Introduce the experimental ladder: zero-shot -&gt; 4-shot -&gt; LoRA fine-tuning -&gt; TF-IDF baselines -&gt; GraphCodeBERT.</w:t>
       </w:r>
     </w:p>
     <w:p>
@@ -175,7 +175,7 @@
         <w:pStyle w:val="ListNumber"/>
       </w:pPr>
       <w:r>
-        <w:t>Interpret the result: GraphCodeBERT is strongest; 4-shot collapse is a useful negative result.</w:t>
+        <w:t>Interpret the result: GraphCodeBERT has the best balanced Macro-F1; TF-IDF Logistic Regression is surprisingly strong; 4-shot collapse is a useful negative result.</w:t>
       </w:r>
     </w:p>
     <w:p>
@@ -578,6 +578,276 @@
                 <w:sz w:val="18"/>
               </w:rPr>
               <w:t>Training + validation + test complete</w:t>
+            </w:r>
+          </w:p>
+        </w:tc>
+      </w:tr>
+      <w:tr>
+        <w:tc>
+          <w:tcPr>
+            <w:tcW w:type="dxa" w:w="2484"/>
+            <w:tcBorders>
+              <w:top w:val="single" w:sz="4" w:space="0" w:color="D9E2F3"/>
+              <w:left w:val="single" w:sz="4" w:space="0" w:color="D9E2F3"/>
+              <w:bottom w:val="single" w:sz="4" w:space="0" w:color="D9E2F3"/>
+              <w:right w:val="single" w:sz="4" w:space="0" w:color="D9E2F3"/>
+            </w:tcBorders>
+          </w:tcPr>
+          <w:p>
+            <w:pPr>
+              <w:jc w:val="left"/>
+            </w:pPr>
+            <w:r>
+              <w:rPr>
+                <w:sz w:val="18"/>
+              </w:rPr>
+              <w:t>Majority baseline</w:t>
+            </w:r>
+          </w:p>
+        </w:tc>
+        <w:tc>
+          <w:tcPr>
+            <w:tcW w:type="dxa" w:w="2484"/>
+            <w:tcBorders>
+              <w:top w:val="single" w:sz="4" w:space="0" w:color="D9E2F3"/>
+              <w:left w:val="single" w:sz="4" w:space="0" w:color="D9E2F3"/>
+              <w:bottom w:val="single" w:sz="4" w:space="0" w:color="D9E2F3"/>
+              <w:right w:val="single" w:sz="4" w:space="0" w:color="D9E2F3"/>
+            </w:tcBorders>
+          </w:tcPr>
+          <w:p>
+            <w:pPr>
+              <w:jc w:val="center"/>
+            </w:pPr>
+            <w:r>
+              <w:rPr>
+                <w:sz w:val="18"/>
+              </w:rPr>
+              <w:t>Sanity-check majority-class behavior</w:t>
+            </w:r>
+          </w:p>
+        </w:tc>
+        <w:tc>
+          <w:tcPr>
+            <w:tcW w:type="dxa" w:w="2484"/>
+            <w:tcBorders>
+              <w:top w:val="single" w:sz="4" w:space="0" w:color="D9E2F3"/>
+              <w:left w:val="single" w:sz="4" w:space="0" w:color="D9E2F3"/>
+              <w:bottom w:val="single" w:sz="4" w:space="0" w:color="D9E2F3"/>
+              <w:right w:val="single" w:sz="4" w:space="0" w:color="D9E2F3"/>
+            </w:tcBorders>
+          </w:tcPr>
+          <w:p>
+            <w:pPr>
+              <w:jc w:val="center"/>
+            </w:pPr>
+            <w:r>
+              <w:rPr>
+                <w:sz w:val="18"/>
+              </w:rPr>
+              <w:t>Most frequent class</w:t>
+            </w:r>
+          </w:p>
+        </w:tc>
+        <w:tc>
+          <w:tcPr>
+            <w:tcW w:type="dxa" w:w="2484"/>
+            <w:tcBorders>
+              <w:top w:val="single" w:sz="4" w:space="0" w:color="D9E2F3"/>
+              <w:left w:val="single" w:sz="4" w:space="0" w:color="D9E2F3"/>
+              <w:bottom w:val="single" w:sz="4" w:space="0" w:color="D9E2F3"/>
+              <w:right w:val="single" w:sz="4" w:space="0" w:color="D9E2F3"/>
+            </w:tcBorders>
+          </w:tcPr>
+          <w:p>
+            <w:pPr>
+              <w:jc w:val="center"/>
+            </w:pPr>
+            <w:r>
+              <w:rPr>
+                <w:sz w:val="18"/>
+              </w:rPr>
+              <w:t>Test complete</w:t>
+            </w:r>
+          </w:p>
+        </w:tc>
+      </w:tr>
+      <w:tr>
+        <w:tc>
+          <w:tcPr>
+            <w:tcW w:type="dxa" w:w="2484"/>
+            <w:tcBorders>
+              <w:top w:val="single" w:sz="4" w:space="0" w:color="D9E2F3"/>
+              <w:left w:val="single" w:sz="4" w:space="0" w:color="D9E2F3"/>
+              <w:bottom w:val="single" w:sz="4" w:space="0" w:color="D9E2F3"/>
+              <w:right w:val="single" w:sz="4" w:space="0" w:color="D9E2F3"/>
+            </w:tcBorders>
+          </w:tcPr>
+          <w:p>
+            <w:pPr>
+              <w:jc w:val="left"/>
+            </w:pPr>
+            <w:r>
+              <w:rPr>
+                <w:sz w:val="18"/>
+              </w:rPr>
+              <w:t>TF-IDF Linear SVM</w:t>
+            </w:r>
+          </w:p>
+        </w:tc>
+        <w:tc>
+          <w:tcPr>
+            <w:tcW w:type="dxa" w:w="2484"/>
+            <w:tcBorders>
+              <w:top w:val="single" w:sz="4" w:space="0" w:color="D9E2F3"/>
+              <w:left w:val="single" w:sz="4" w:space="0" w:color="D9E2F3"/>
+              <w:bottom w:val="single" w:sz="4" w:space="0" w:color="D9E2F3"/>
+              <w:right w:val="single" w:sz="4" w:space="0" w:color="D9E2F3"/>
+            </w:tcBorders>
+          </w:tcPr>
+          <w:p>
+            <w:pPr>
+              <w:jc w:val="center"/>
+            </w:pPr>
+            <w:r>
+              <w:rPr>
+                <w:sz w:val="18"/>
+              </w:rPr>
+              <w:t>Compare against a traditional lexical ML baseline</w:t>
+            </w:r>
+          </w:p>
+        </w:tc>
+        <w:tc>
+          <w:tcPr>
+            <w:tcW w:type="dxa" w:w="2484"/>
+            <w:tcBorders>
+              <w:top w:val="single" w:sz="4" w:space="0" w:color="D9E2F3"/>
+              <w:left w:val="single" w:sz="4" w:space="0" w:color="D9E2F3"/>
+              <w:bottom w:val="single" w:sz="4" w:space="0" w:color="D9E2F3"/>
+              <w:right w:val="single" w:sz="4" w:space="0" w:color="D9E2F3"/>
+            </w:tcBorders>
+          </w:tcPr>
+          <w:p>
+            <w:pPr>
+              <w:jc w:val="center"/>
+            </w:pPr>
+            <w:r>
+              <w:rPr>
+                <w:sz w:val="18"/>
+              </w:rPr>
+              <w:t>Supervised CPU classifier</w:t>
+            </w:r>
+          </w:p>
+        </w:tc>
+        <w:tc>
+          <w:tcPr>
+            <w:tcW w:type="dxa" w:w="2484"/>
+            <w:tcBorders>
+              <w:top w:val="single" w:sz="4" w:space="0" w:color="D9E2F3"/>
+              <w:left w:val="single" w:sz="4" w:space="0" w:color="D9E2F3"/>
+              <w:bottom w:val="single" w:sz="4" w:space="0" w:color="D9E2F3"/>
+              <w:right w:val="single" w:sz="4" w:space="0" w:color="D9E2F3"/>
+            </w:tcBorders>
+          </w:tcPr>
+          <w:p>
+            <w:pPr>
+              <w:jc w:val="center"/>
+            </w:pPr>
+            <w:r>
+              <w:rPr>
+                <w:sz w:val="18"/>
+              </w:rPr>
+              <w:t>Test complete</w:t>
+            </w:r>
+          </w:p>
+        </w:tc>
+      </w:tr>
+      <w:tr>
+        <w:tc>
+          <w:tcPr>
+            <w:tcW w:type="dxa" w:w="2484"/>
+            <w:tcBorders>
+              <w:top w:val="single" w:sz="4" w:space="0" w:color="D9E2F3"/>
+              <w:left w:val="single" w:sz="4" w:space="0" w:color="D9E2F3"/>
+              <w:bottom w:val="single" w:sz="4" w:space="0" w:color="D9E2F3"/>
+              <w:right w:val="single" w:sz="4" w:space="0" w:color="D9E2F3"/>
+            </w:tcBorders>
+          </w:tcPr>
+          <w:p>
+            <w:pPr>
+              <w:jc w:val="left"/>
+            </w:pPr>
+            <w:r>
+              <w:rPr>
+                <w:sz w:val="18"/>
+              </w:rPr>
+              <w:t>TF-IDF Logistic Regression</w:t>
+            </w:r>
+          </w:p>
+        </w:tc>
+        <w:tc>
+          <w:tcPr>
+            <w:tcW w:type="dxa" w:w="2484"/>
+            <w:tcBorders>
+              <w:top w:val="single" w:sz="4" w:space="0" w:color="D9E2F3"/>
+              <w:left w:val="single" w:sz="4" w:space="0" w:color="D9E2F3"/>
+              <w:bottom w:val="single" w:sz="4" w:space="0" w:color="D9E2F3"/>
+              <w:right w:val="single" w:sz="4" w:space="0" w:color="D9E2F3"/>
+            </w:tcBorders>
+          </w:tcPr>
+          <w:p>
+            <w:pPr>
+              <w:jc w:val="center"/>
+            </w:pPr>
+            <w:r>
+              <w:rPr>
+                <w:sz w:val="18"/>
+              </w:rPr>
+              <w:t>Compare against a strong lexical ML baseline</w:t>
+            </w:r>
+          </w:p>
+        </w:tc>
+        <w:tc>
+          <w:tcPr>
+            <w:tcW w:type="dxa" w:w="2484"/>
+            <w:tcBorders>
+              <w:top w:val="single" w:sz="4" w:space="0" w:color="D9E2F3"/>
+              <w:left w:val="single" w:sz="4" w:space="0" w:color="D9E2F3"/>
+              <w:bottom w:val="single" w:sz="4" w:space="0" w:color="D9E2F3"/>
+              <w:right w:val="single" w:sz="4" w:space="0" w:color="D9E2F3"/>
+            </w:tcBorders>
+          </w:tcPr>
+          <w:p>
+            <w:pPr>
+              <w:jc w:val="center"/>
+            </w:pPr>
+            <w:r>
+              <w:rPr>
+                <w:sz w:val="18"/>
+              </w:rPr>
+              <w:t>Supervised CPU classifier</w:t>
+            </w:r>
+          </w:p>
+        </w:tc>
+        <w:tc>
+          <w:tcPr>
+            <w:tcW w:type="dxa" w:w="2484"/>
+            <w:tcBorders>
+              <w:top w:val="single" w:sz="4" w:space="0" w:color="D9E2F3"/>
+              <w:left w:val="single" w:sz="4" w:space="0" w:color="D9E2F3"/>
+              <w:bottom w:val="single" w:sz="4" w:space="0" w:color="D9E2F3"/>
+              <w:right w:val="single" w:sz="4" w:space="0" w:color="D9E2F3"/>
+            </w:tcBorders>
+          </w:tcPr>
+          <w:p>
+            <w:pPr>
+              <w:jc w:val="center"/>
+            </w:pPr>
+            <w:r>
+              <w:rPr>
+                <w:sz w:val="18"/>
+              </w:rPr>
+              <w:t>Test complete</w:t>
             </w:r>
           </w:p>
         </w:tc>
@@ -1723,6 +1993,408 @@
               <w:rPr>
                 <w:sz w:val="18"/>
               </w:rPr>
+              <w:t>Majority baseline</w:t>
+            </w:r>
+          </w:p>
+        </w:tc>
+        <w:tc>
+          <w:tcPr>
+            <w:tcW w:type="dxa" w:w="1656"/>
+            <w:tcBorders>
+              <w:top w:val="single" w:sz="4" w:space="0" w:color="D9E2F3"/>
+              <w:left w:val="single" w:sz="4" w:space="0" w:color="D9E2F3"/>
+              <w:bottom w:val="single" w:sz="4" w:space="0" w:color="D9E2F3"/>
+              <w:right w:val="single" w:sz="4" w:space="0" w:color="D9E2F3"/>
+            </w:tcBorders>
+          </w:tcPr>
+          <w:p>
+            <w:pPr>
+              <w:jc w:val="center"/>
+            </w:pPr>
+            <w:r>
+              <w:rPr>
+                <w:sz w:val="18"/>
+              </w:rPr>
+              <w:t>Test</w:t>
+            </w:r>
+          </w:p>
+        </w:tc>
+        <w:tc>
+          <w:tcPr>
+            <w:tcW w:type="dxa" w:w="1656"/>
+            <w:tcBorders>
+              <w:top w:val="single" w:sz="4" w:space="0" w:color="D9E2F3"/>
+              <w:left w:val="single" w:sz="4" w:space="0" w:color="D9E2F3"/>
+              <w:bottom w:val="single" w:sz="4" w:space="0" w:color="D9E2F3"/>
+              <w:right w:val="single" w:sz="4" w:space="0" w:color="D9E2F3"/>
+            </w:tcBorders>
+          </w:tcPr>
+          <w:p>
+            <w:pPr>
+              <w:jc w:val="center"/>
+            </w:pPr>
+            <w:r>
+              <w:rPr>
+                <w:sz w:val="18"/>
+              </w:rPr>
+              <w:t>0.5406</w:t>
+            </w:r>
+          </w:p>
+        </w:tc>
+        <w:tc>
+          <w:tcPr>
+            <w:tcW w:type="dxa" w:w="1656"/>
+            <w:tcBorders>
+              <w:top w:val="single" w:sz="4" w:space="0" w:color="D9E2F3"/>
+              <w:left w:val="single" w:sz="4" w:space="0" w:color="D9E2F3"/>
+              <w:bottom w:val="single" w:sz="4" w:space="0" w:color="D9E2F3"/>
+              <w:right w:val="single" w:sz="4" w:space="0" w:color="D9E2F3"/>
+            </w:tcBorders>
+          </w:tcPr>
+          <w:p>
+            <w:pPr>
+              <w:jc w:val="center"/>
+            </w:pPr>
+            <w:r>
+              <w:rPr>
+                <w:sz w:val="18"/>
+              </w:rPr>
+              <w:t>0.3509</w:t>
+            </w:r>
+          </w:p>
+        </w:tc>
+        <w:tc>
+          <w:tcPr>
+            <w:tcW w:type="dxa" w:w="1656"/>
+            <w:tcBorders>
+              <w:top w:val="single" w:sz="4" w:space="0" w:color="D9E2F3"/>
+              <w:left w:val="single" w:sz="4" w:space="0" w:color="D9E2F3"/>
+              <w:bottom w:val="single" w:sz="4" w:space="0" w:color="D9E2F3"/>
+              <w:right w:val="single" w:sz="4" w:space="0" w:color="D9E2F3"/>
+            </w:tcBorders>
+          </w:tcPr>
+          <w:p>
+            <w:pPr>
+              <w:jc w:val="center"/>
+            </w:pPr>
+            <w:r>
+              <w:rPr>
+                <w:sz w:val="18"/>
+              </w:rPr>
+              <w:t>0.0000</w:t>
+            </w:r>
+          </w:p>
+        </w:tc>
+        <w:tc>
+          <w:tcPr>
+            <w:tcW w:type="dxa" w:w="1656"/>
+            <w:tcBorders>
+              <w:top w:val="single" w:sz="4" w:space="0" w:color="D9E2F3"/>
+              <w:left w:val="single" w:sz="4" w:space="0" w:color="D9E2F3"/>
+              <w:bottom w:val="single" w:sz="4" w:space="0" w:color="D9E2F3"/>
+              <w:right w:val="single" w:sz="4" w:space="0" w:color="D9E2F3"/>
+            </w:tcBorders>
+          </w:tcPr>
+          <w:p>
+            <w:pPr>
+              <w:jc w:val="center"/>
+            </w:pPr>
+            <w:r>
+              <w:rPr>
+                <w:sz w:val="18"/>
+              </w:rPr>
+              <w:t>Sanity check; same collapse as 4-shot</w:t>
+            </w:r>
+          </w:p>
+        </w:tc>
+      </w:tr>
+      <w:tr>
+        <w:tc>
+          <w:tcPr>
+            <w:tcW w:type="dxa" w:w="1656"/>
+            <w:tcBorders>
+              <w:top w:val="single" w:sz="4" w:space="0" w:color="D9E2F3"/>
+              <w:left w:val="single" w:sz="4" w:space="0" w:color="D9E2F3"/>
+              <w:bottom w:val="single" w:sz="4" w:space="0" w:color="D9E2F3"/>
+              <w:right w:val="single" w:sz="4" w:space="0" w:color="D9E2F3"/>
+            </w:tcBorders>
+          </w:tcPr>
+          <w:p>
+            <w:pPr>
+              <w:jc w:val="left"/>
+            </w:pPr>
+            <w:r>
+              <w:rPr>
+                <w:sz w:val="18"/>
+              </w:rPr>
+              <w:t>TF-IDF Linear SVM</w:t>
+            </w:r>
+          </w:p>
+        </w:tc>
+        <w:tc>
+          <w:tcPr>
+            <w:tcW w:type="dxa" w:w="1656"/>
+            <w:tcBorders>
+              <w:top w:val="single" w:sz="4" w:space="0" w:color="D9E2F3"/>
+              <w:left w:val="single" w:sz="4" w:space="0" w:color="D9E2F3"/>
+              <w:bottom w:val="single" w:sz="4" w:space="0" w:color="D9E2F3"/>
+              <w:right w:val="single" w:sz="4" w:space="0" w:color="D9E2F3"/>
+            </w:tcBorders>
+          </w:tcPr>
+          <w:p>
+            <w:pPr>
+              <w:jc w:val="center"/>
+            </w:pPr>
+            <w:r>
+              <w:rPr>
+                <w:sz w:val="18"/>
+              </w:rPr>
+              <w:t>Test</w:t>
+            </w:r>
+          </w:p>
+        </w:tc>
+        <w:tc>
+          <w:tcPr>
+            <w:tcW w:type="dxa" w:w="1656"/>
+            <w:tcBorders>
+              <w:top w:val="single" w:sz="4" w:space="0" w:color="D9E2F3"/>
+              <w:left w:val="single" w:sz="4" w:space="0" w:color="D9E2F3"/>
+              <w:bottom w:val="single" w:sz="4" w:space="0" w:color="D9E2F3"/>
+              <w:right w:val="single" w:sz="4" w:space="0" w:color="D9E2F3"/>
+            </w:tcBorders>
+          </w:tcPr>
+          <w:p>
+            <w:pPr>
+              <w:jc w:val="center"/>
+            </w:pPr>
+            <w:r>
+              <w:rPr>
+                <w:sz w:val="18"/>
+              </w:rPr>
+              <w:t>0.6007</w:t>
+            </w:r>
+          </w:p>
+        </w:tc>
+        <w:tc>
+          <w:tcPr>
+            <w:tcW w:type="dxa" w:w="1656"/>
+            <w:tcBorders>
+              <w:top w:val="single" w:sz="4" w:space="0" w:color="D9E2F3"/>
+              <w:left w:val="single" w:sz="4" w:space="0" w:color="D9E2F3"/>
+              <w:bottom w:val="single" w:sz="4" w:space="0" w:color="D9E2F3"/>
+              <w:right w:val="single" w:sz="4" w:space="0" w:color="D9E2F3"/>
+            </w:tcBorders>
+          </w:tcPr>
+          <w:p>
+            <w:pPr>
+              <w:jc w:val="center"/>
+            </w:pPr>
+            <w:r>
+              <w:rPr>
+                <w:sz w:val="18"/>
+              </w:rPr>
+              <w:t>0.5994</w:t>
+            </w:r>
+          </w:p>
+        </w:tc>
+        <w:tc>
+          <w:tcPr>
+            <w:tcW w:type="dxa" w:w="1656"/>
+            <w:tcBorders>
+              <w:top w:val="single" w:sz="4" w:space="0" w:color="D9E2F3"/>
+              <w:left w:val="single" w:sz="4" w:space="0" w:color="D9E2F3"/>
+              <w:bottom w:val="single" w:sz="4" w:space="0" w:color="D9E2F3"/>
+              <w:right w:val="single" w:sz="4" w:space="0" w:color="D9E2F3"/>
+            </w:tcBorders>
+          </w:tcPr>
+          <w:p>
+            <w:pPr>
+              <w:jc w:val="center"/>
+            </w:pPr>
+            <w:r>
+              <w:rPr>
+                <w:sz w:val="18"/>
+              </w:rPr>
+              <w:t>0.5766</w:t>
+            </w:r>
+          </w:p>
+        </w:tc>
+        <w:tc>
+          <w:tcPr>
+            <w:tcW w:type="dxa" w:w="1656"/>
+            <w:tcBorders>
+              <w:top w:val="single" w:sz="4" w:space="0" w:color="D9E2F3"/>
+              <w:left w:val="single" w:sz="4" w:space="0" w:color="D9E2F3"/>
+              <w:bottom w:val="single" w:sz="4" w:space="0" w:color="D9E2F3"/>
+              <w:right w:val="single" w:sz="4" w:space="0" w:color="D9E2F3"/>
+            </w:tcBorders>
+          </w:tcPr>
+          <w:p>
+            <w:pPr>
+              <w:jc w:val="center"/>
+            </w:pPr>
+            <w:r>
+              <w:rPr>
+                <w:sz w:val="18"/>
+              </w:rPr>
+              <w:t>Strong lexical CPU baseline</w:t>
+            </w:r>
+          </w:p>
+        </w:tc>
+      </w:tr>
+      <w:tr>
+        <w:tc>
+          <w:tcPr>
+            <w:tcW w:type="dxa" w:w="1656"/>
+            <w:tcBorders>
+              <w:top w:val="single" w:sz="4" w:space="0" w:color="D9E2F3"/>
+              <w:left w:val="single" w:sz="4" w:space="0" w:color="D9E2F3"/>
+              <w:bottom w:val="single" w:sz="4" w:space="0" w:color="D9E2F3"/>
+              <w:right w:val="single" w:sz="4" w:space="0" w:color="D9E2F3"/>
+            </w:tcBorders>
+          </w:tcPr>
+          <w:p>
+            <w:pPr>
+              <w:jc w:val="left"/>
+            </w:pPr>
+            <w:r>
+              <w:rPr>
+                <w:sz w:val="18"/>
+              </w:rPr>
+              <w:t>TF-IDF Logistic Regression</w:t>
+            </w:r>
+          </w:p>
+        </w:tc>
+        <w:tc>
+          <w:tcPr>
+            <w:tcW w:type="dxa" w:w="1656"/>
+            <w:tcBorders>
+              <w:top w:val="single" w:sz="4" w:space="0" w:color="D9E2F3"/>
+              <w:left w:val="single" w:sz="4" w:space="0" w:color="D9E2F3"/>
+              <w:bottom w:val="single" w:sz="4" w:space="0" w:color="D9E2F3"/>
+              <w:right w:val="single" w:sz="4" w:space="0" w:color="D9E2F3"/>
+            </w:tcBorders>
+          </w:tcPr>
+          <w:p>
+            <w:pPr>
+              <w:jc w:val="center"/>
+            </w:pPr>
+            <w:r>
+              <w:rPr>
+                <w:sz w:val="18"/>
+              </w:rPr>
+              <w:t>Test</w:t>
+            </w:r>
+          </w:p>
+        </w:tc>
+        <w:tc>
+          <w:tcPr>
+            <w:tcW w:type="dxa" w:w="1656"/>
+            <w:tcBorders>
+              <w:top w:val="single" w:sz="4" w:space="0" w:color="D9E2F3"/>
+              <w:left w:val="single" w:sz="4" w:space="0" w:color="D9E2F3"/>
+              <w:bottom w:val="single" w:sz="4" w:space="0" w:color="D9E2F3"/>
+              <w:right w:val="single" w:sz="4" w:space="0" w:color="D9E2F3"/>
+            </w:tcBorders>
+          </w:tcPr>
+          <w:p>
+            <w:pPr>
+              <w:jc w:val="center"/>
+            </w:pPr>
+            <w:r>
+              <w:rPr>
+                <w:sz w:val="18"/>
+              </w:rPr>
+              <w:t>0.6223</w:t>
+            </w:r>
+          </w:p>
+        </w:tc>
+        <w:tc>
+          <w:tcPr>
+            <w:tcW w:type="dxa" w:w="1656"/>
+            <w:tcBorders>
+              <w:top w:val="single" w:sz="4" w:space="0" w:color="D9E2F3"/>
+              <w:left w:val="single" w:sz="4" w:space="0" w:color="D9E2F3"/>
+              <w:bottom w:val="single" w:sz="4" w:space="0" w:color="D9E2F3"/>
+              <w:right w:val="single" w:sz="4" w:space="0" w:color="D9E2F3"/>
+            </w:tcBorders>
+          </w:tcPr>
+          <w:p>
+            <w:pPr>
+              <w:jc w:val="center"/>
+            </w:pPr>
+            <w:r>
+              <w:rPr>
+                <w:sz w:val="18"/>
+              </w:rPr>
+              <w:t>0.6218</w:t>
+            </w:r>
+          </w:p>
+        </w:tc>
+        <w:tc>
+          <w:tcPr>
+            <w:tcW w:type="dxa" w:w="1656"/>
+            <w:tcBorders>
+              <w:top w:val="single" w:sz="4" w:space="0" w:color="D9E2F3"/>
+              <w:left w:val="single" w:sz="4" w:space="0" w:color="D9E2F3"/>
+              <w:bottom w:val="single" w:sz="4" w:space="0" w:color="D9E2F3"/>
+              <w:right w:val="single" w:sz="4" w:space="0" w:color="D9E2F3"/>
+            </w:tcBorders>
+          </w:tcPr>
+          <w:p>
+            <w:pPr>
+              <w:jc w:val="center"/>
+            </w:pPr>
+            <w:r>
+              <w:rPr>
+                <w:sz w:val="18"/>
+              </w:rPr>
+              <w:t>0.6088</w:t>
+            </w:r>
+          </w:p>
+        </w:tc>
+        <w:tc>
+          <w:tcPr>
+            <w:tcW w:type="dxa" w:w="1656"/>
+            <w:tcBorders>
+              <w:top w:val="single" w:sz="4" w:space="0" w:color="D9E2F3"/>
+              <w:left w:val="single" w:sz="4" w:space="0" w:color="D9E2F3"/>
+              <w:bottom w:val="single" w:sz="4" w:space="0" w:color="D9E2F3"/>
+              <w:right w:val="single" w:sz="4" w:space="0" w:color="D9E2F3"/>
+            </w:tcBorders>
+          </w:tcPr>
+          <w:p>
+            <w:pPr>
+              <w:jc w:val="center"/>
+            </w:pPr>
+            <w:r>
+              <w:rPr>
+                <w:sz w:val="18"/>
+              </w:rPr>
+              <w:t>Strongest traditional CPU baseline</w:t>
+            </w:r>
+          </w:p>
+        </w:tc>
+      </w:tr>
+      <w:tr>
+        <w:tc>
+          <w:tcPr>
+            <w:tcW w:type="dxa" w:w="1656"/>
+            <w:tcBorders>
+              <w:top w:val="single" w:sz="4" w:space="0" w:color="D9E2F3"/>
+              <w:left w:val="single" w:sz="4" w:space="0" w:color="D9E2F3"/>
+              <w:bottom w:val="single" w:sz="4" w:space="0" w:color="D9E2F3"/>
+              <w:right w:val="single" w:sz="4" w:space="0" w:color="D9E2F3"/>
+            </w:tcBorders>
+          </w:tcPr>
+          <w:p>
+            <w:pPr>
+              <w:jc w:val="left"/>
+            </w:pPr>
+            <w:r>
+              <w:rPr>
+                <w:sz w:val="18"/>
+              </w:rPr>
               <w:t>GraphCodeBERT</w:t>
             </w:r>
           </w:p>
@@ -2006,7 +2678,7 @@
               <w:t xml:space="preserve">Main conclusion: </w:t>
             </w:r>
             <w:r>
-              <w:t>For code defect detection, a code-specific supervised encoder outperformed prompt-only Qwen and LoRA fine-tuned Qwen. The result suggests task supervision and code-pretraining matter more than simply adding few-shot examples.</w:t>
+              <w:t>For code defect detection, supervised baselines outperform prompt-only Qwen. TF-IDF Logistic Regression is surprisingly competitive, while GraphCodeBERT gives the strongest balanced test Macro-F1. The result suggests task supervision and code-aware modeling matter more than simply adding few-shot examples.</w:t>
             </w:r>
           </w:p>
         </w:tc>
@@ -2584,7 +3256,7 @@
               <w:rPr>
                 <w:sz w:val="18"/>
               </w:rPr>
-              <w:t>Zero-shot, 4-shot, LoRA, GraphCodeBERT.</w:t>
+              <w:t>Zero-shot, 4-shot, LoRA, TF-IDF baselines, GraphCodeBERT.</w:t>
             </w:r>
           </w:p>
         </w:tc>
@@ -2764,7 +3436,7 @@
               <w:rPr>
                 <w:sz w:val="18"/>
               </w:rPr>
-              <w:t>GraphCodeBERT wins; 4-shot collapse explained.</w:t>
+              <w:t>GraphCodeBERT has best Macro-F1; TF-IDF Logistic Regression is competitive; 4-shot collapse explained.</w:t>
             </w:r>
           </w:p>
         </w:tc>
@@ -3192,7 +3864,7 @@
                 <w:rFonts w:ascii="Consolas" w:hAnsi="Consolas"/>
                 <w:sz w:val="18"/>
               </w:rPr>
-              <w:t>5. Methods: Qwen zero-shot, Qwen 4-shot, Qwen LoRA fine-tuning, GraphCodeBERT supervised encoder.</w:t>
+              <w:t>5. Methods: Qwen zero-shot, Qwen 4-shot, Qwen LoRA fine-tuning, majority baseline, TF-IDF Linear SVM, TF-IDF Logistic Regression, and GraphCodeBERT supervised encoder.</w:t>
             </w:r>
           </w:p>
           <w:p>
@@ -3246,6 +3918,33 @@
                 <w:rFonts w:ascii="Consolas" w:hAnsi="Consolas"/>
                 <w:sz w:val="18"/>
               </w:rPr>
+              <w:t xml:space="preserve">   - Majority baseline test: Accuracy 0.5406, Macro-F1 0.3509, Defective-F1 0.0000.</w:t>
+            </w:r>
+          </w:p>
+          <w:p>
+            <w:r>
+              <w:rPr>
+                <w:rFonts w:ascii="Consolas" w:hAnsi="Consolas"/>
+                <w:sz w:val="18"/>
+              </w:rPr>
+              <w:t xml:space="preserve">   - TF-IDF Linear SVM test: Accuracy 0.6007, Macro-F1 0.5994, Defective-F1 0.5766.</w:t>
+            </w:r>
+          </w:p>
+          <w:p>
+            <w:r>
+              <w:rPr>
+                <w:rFonts w:ascii="Consolas" w:hAnsi="Consolas"/>
+                <w:sz w:val="18"/>
+              </w:rPr>
+              <w:t xml:space="preserve">   - TF-IDF Logistic Regression test: Accuracy 0.6223, Macro-F1 0.6218, Defective-F1 0.6088.</w:t>
+            </w:r>
+          </w:p>
+          <w:p>
+            <w:r>
+              <w:rPr>
+                <w:rFonts w:ascii="Consolas" w:hAnsi="Consolas"/>
+                <w:sz w:val="18"/>
+              </w:rPr>
               <w:t xml:space="preserve">   - GraphCodeBERT test: Accuracy 0.6589, Macro-F1 0.6517, Defective-F1 0.6017.</w:t>
             </w:r>
           </w:p>
@@ -3255,7 +3954,7 @@
                 <w:rFonts w:ascii="Consolas" w:hAnsi="Consolas"/>
                 <w:sz w:val="18"/>
               </w:rPr>
-              <w:t>8. Confusion matrix slide: emphasize that 4-shot collapsed to non-defective, while GraphCodeBERT catches more defective samples.</w:t>
+              <w:t>8. Confusion matrix slide: emphasize that 4-shot and majority collapsed to non-defective, TF-IDF Logistic Regression catches many defective samples, and GraphCodeBERT has the best balanced Macro-F1.</w:t>
             </w:r>
           </w:p>
           <w:p>
@@ -3273,7 +3972,7 @@
                 <w:rFonts w:ascii="Consolas" w:hAnsi="Consolas"/>
                 <w:sz w:val="18"/>
               </w:rPr>
-              <w:t>10. Conclusion: prompt-only LLMs are weak for this task; LoRA helps but code-specific supervised GraphCodeBERT is strongest.</w:t>
+              <w:t>10. Conclusion: prompt-only LLMs are weak for this task; TF-IDF baselines are strong; GraphCodeBERT is the best balanced model.</w:t>
             </w:r>
           </w:p>
           <w:p>
@@ -3406,6 +4105,14 @@
       </w:pPr>
       <w:r>
         <w:t>Zero-shot and 4-shot metrics: results/zero_shot_*_metrics.json and results/four_shot_*_metrics.json</w:t>
+      </w:r>
+    </w:p>
+    <w:p>
+      <w:pPr>
+        <w:pStyle w:val="ListBullet"/>
+      </w:pPr>
+      <w:r>
+        <w:t>CPU baseline test metrics: results/majority_test_metrics.json, results/tfidf_linear_svm_test_metrics.json, and results/tfidf_logreg_test_metrics.json</w:t>
       </w:r>
     </w:p>
     <w:p>

</xml_diff>